<commit_message>
Esquema versionado: 27 migraciones y 8 Edge Functions
</commit_message>
<xml_diff>
--- a/documentos/Manual-del-alumno-AulaFacil.docx
+++ b/documentos/Manual-del-alumno-AulaFacil.docx
@@ -82,7 +82,7 @@
           <w:sz w:val="20"/>
           <w:szCs w:val="20"/>
         </w:rPr>
-        <w:t xml:space="preserve">Versión 1.0 · Septiembre 2026</w:t>
+        <w:t xml:space="preserve">Versión 1.1 · Septiembre 2026</w:t>
       </w:r>
     </w:p>
     <w:p>
@@ -135,7 +135,7 @@
           <w:sz w:val="22"/>
           <w:szCs w:val="22"/>
         </w:rPr>
-        <w:t xml:space="preserve">Tu usuario es tu matrícula.</w:t>
+        <w:t xml:space="preserve">Tu usuario es la matrícula que te dio tu maestro. Casi siempre es el número tal cual, pero a veces trae algo extra al final; usa exactamente el que te haya pasado.</w:t>
       </w:r>
     </w:p>
     <w:p>
@@ -153,7 +153,7 @@
           <w:sz w:val="22"/>
           <w:szCs w:val="22"/>
         </w:rPr>
-        <w:t xml:space="preserve">Tu contraseña inicial también es tu matrícula.</w:t>
+        <w:t xml:space="preserve">Tu contraseña inicial es esa misma matrícula.</w:t>
       </w:r>
     </w:p>
     <w:p>
@@ -172,6 +172,19 @@
           <w:szCs w:val="22"/>
         </w:rPr>
         <w:t xml:space="preserve">Cámbiala la primera vez que entres, desde tu perfil.</w:t>
+      </w:r>
+    </w:p>
+    <w:p>
+      <w:pPr>
+        <w:spacing w:after="120" w:line="276"/>
+      </w:pPr>
+      <w:r>
+        <w:rPr>
+          <w:rFonts w:ascii="Calibri" w:cs="Calibri" w:eastAsia="Calibri" w:hAnsi="Calibri"/>
+          <w:sz w:val="22"/>
+          <w:szCs w:val="22"/>
+        </w:rPr>
+        <w:t xml:space="preserve">Si llevas clase con varios maestros, es normal que tengas un usuario distinto en cada materia. No están revueltos: cada maestro lleva su propia lista. Apunta cuál te sirve para cuál clase.</w:t>
       </w:r>
     </w:p>
     <w:p>
@@ -1085,7 +1098,7 @@
                 <w:sz w:val="20"/>
                 <w:szCs w:val="20"/>
               </w:rPr>
-              <w:t xml:space="preserve">Revisa que tu usuario sea tu matrícula, sin espacios</w:t>
+              <w:t xml:space="preserve">Revisa que sea el usuario de esa materia, escrito sin espacios</w:t>
             </w:r>
           </w:p>
         </w:tc>
@@ -1114,7 +1127,7 @@
                 <w:sz w:val="20"/>
                 <w:szCs w:val="20"/>
               </w:rPr>
-              <w:t xml:space="preserve">El QR no me deja entrar</w:t>
+              <w:t xml:space="preserve">Me sirve en una clase pero no en otra</w:t>
             </w:r>
           </w:p>
         </w:tc>
@@ -1141,7 +1154,7 @@
                 <w:sz w:val="20"/>
                 <w:szCs w:val="20"/>
               </w:rPr>
-              <w:t xml:space="preserve">Vuelve a escanear: el código cambia cada 20 segundos</w:t>
+              <w:t xml:space="preserve">Es normal: cada maestro te da un usuario. Pídele el suyo</w:t>
             </w:r>
           </w:p>
         </w:tc>
@@ -1169,7 +1182,7 @@
                 <w:sz w:val="20"/>
                 <w:szCs w:val="20"/>
               </w:rPr>
-              <w:t xml:space="preserve">No me deja marcar que participé</w:t>
+              <w:t xml:space="preserve">El QR no me deja entrar</w:t>
             </w:r>
           </w:p>
         </w:tc>
@@ -1195,7 +1208,7 @@
                 <w:sz w:val="20"/>
                 <w:szCs w:val="20"/>
               </w:rPr>
-              <w:t xml:space="preserve">Escanea primero el QR de la clase para registrar tu presencia</w:t>
+              <w:t xml:space="preserve">Vuelve a escanear: el código cambia cada 20 segundos</w:t>
             </w:r>
           </w:p>
         </w:tc>
@@ -1224,7 +1237,7 @@
                 <w:sz w:val="20"/>
                 <w:szCs w:val="20"/>
               </w:rPr>
-              <w:t xml:space="preserve">Se me cerró el examen por error</w:t>
+              <w:t xml:space="preserve">No me deja marcar que participé</w:t>
             </w:r>
           </w:p>
         </w:tc>
@@ -1251,7 +1264,7 @@
                 <w:sz w:val="20"/>
                 <w:szCs w:val="20"/>
               </w:rPr>
-              <w:t xml:space="preserve">Avísale a tu maestro: él puede reactivarlo</w:t>
+              <w:t xml:space="preserve">Escanea primero el QR de la clase para registrar tu presencia</w:t>
             </w:r>
           </w:p>
         </w:tc>
@@ -1279,6 +1292,61 @@
                 <w:sz w:val="20"/>
                 <w:szCs w:val="20"/>
               </w:rPr>
+              <w:t xml:space="preserve">Se me cerró el examen por error</w:t>
+            </w:r>
+          </w:p>
+        </w:tc>
+        <w:tc>
+          <w:tcPr>
+            <w:tcW w:type="dxa" w:w="5960"/>
+            <w:tcMar>
+              <w:top w:type="dxa" w:w="70"/>
+              <w:left w:type="dxa" w:w="110"/>
+              <w:bottom w:type="dxa" w:w="70"/>
+              <w:right w:type="dxa" w:w="110"/>
+            </w:tcMar>
+          </w:tcPr>
+          <w:p>
+            <w:pPr>
+              <w:spacing w:after="0"/>
+            </w:pPr>
+            <w:r>
+              <w:rPr>
+                <w:rFonts w:ascii="Calibri" w:cs="Calibri" w:eastAsia="Calibri" w:hAnsi="Calibri"/>
+                <w:b w:val="false"/>
+                <w:bCs w:val="false"/>
+                <w:sz w:val="20"/>
+                <w:szCs w:val="20"/>
+              </w:rPr>
+              <w:t xml:space="preserve">Avísale a tu maestro: él puede reactivarlo</w:t>
+            </w:r>
+          </w:p>
+        </w:tc>
+      </w:tr>
+      <w:tr>
+        <w:tc>
+          <w:tcPr>
+            <w:tcW w:type="dxa" w:w="3400"/>
+            <w:shd w:fill="F2F2F5" w:val="clear"/>
+            <w:tcMar>
+              <w:top w:type="dxa" w:w="70"/>
+              <w:left w:type="dxa" w:w="110"/>
+              <w:bottom w:type="dxa" w:w="70"/>
+              <w:right w:type="dxa" w:w="110"/>
+            </w:tcMar>
+          </w:tcPr>
+          <w:p>
+            <w:pPr>
+              <w:spacing w:after="0"/>
+            </w:pPr>
+            <w:r>
+              <w:rPr>
+                <w:rFonts w:ascii="Calibri" w:cs="Calibri" w:eastAsia="Calibri" w:hAnsi="Calibri"/>
+                <w:b w:val="false"/>
+                <w:bCs w:val="false"/>
+                <w:sz w:val="20"/>
+                <w:szCs w:val="20"/>
+              </w:rPr>
               <w:t xml:space="preserve">La página se ve rara o desactualizada</w:t>
             </w:r>
           </w:p>
@@ -1286,6 +1354,7 @@
         <w:tc>
           <w:tcPr>
             <w:tcW w:type="dxa" w:w="5960"/>
+            <w:shd w:fill="F2F2F5" w:val="clear"/>
             <w:tcMar>
               <w:top w:type="dxa" w:w="70"/>
               <w:left w:type="dxa" w:w="110"/>

</xml_diff>